<commit_message>
FIX: Padronização da sigla MHSL na documentação e Schema
</commit_message>
<xml_diff>
--- a/docs/fonte_dados/dicionario_campos_p5_simplificado.docx
+++ b/docs/fonte_dados/dicionario_campos_p5_simplificado.docx
@@ -26,7 +26,7 @@
           <w:i/>
           <w:iCs/>
         </w:rPr>
-        <w:t xml:space="preserve">Nome da tabela, o que ela aborda, e os campos com descrição. Versão resumida — sem tipo de dado, PK/FK ou alertas técnicos (ver o documento completo para isso).</w:t>
+        <w:t xml:space="preserve">Nome da tabela, o que ela aborda, e os campos com descrição. Versão resumida — sem tipo de dado, PK/FK ou alertas técnicos (ver o documento completo para isso). Atualizado em 20/09 com o de-para de especialidade e a sigla MSHL.</w:t>
       </w:r>
     </w:p>
     <w:p>
@@ -1103,7 +1103,7 @@
           <w:bCs/>
           <w:color w:val="2C3E50"/>
         </w:rPr>
-        <w:t xml:space="preserve">Hospitais e Leitos (Ministério da Saúde)</w:t>
+        <w:t xml:space="preserve">MSHL — Hospitais e Leitos (Ministério da Saúde)</w:t>
       </w:r>
     </w:p>
     <w:p>
@@ -1117,7 +1117,7 @@
           <w:i w:val="false"/>
           <w:iCs w:val="false"/>
         </w:rPr>
-        <w:t xml:space="preserve">É a tabela que traz a identidade do hospital: nome, razão social, endereço, gestão.</w:t>
+        <w:t xml:space="preserve">É a tabela que traz a identidade do hospital: nome, razão social, endereço, gestão. Sigla MSHL adotada pelo time em 20/09.</w:t>
       </w:r>
     </w:p>
     <w:tbl>
@@ -2703,7 +2703,7 @@
                 <w:sz w:val="18"/>
                 <w:szCs w:val="18"/>
               </w:rPr>
-              <w:t xml:space="preserve">CNPJ do hospital (identificador do estabelecimento neste arquivo)</w:t>
+              <w:t xml:space="preserve">CNPJ do hospital — bate com CPF_CNPJ do CNES-LT. Pode ser vazio (LEFT JOIN sempre, nunca INNER)</w:t>
             </w:r>
           </w:p>
         </w:tc>
@@ -7519,6 +7519,275 @@
                 <w:szCs w:val="18"/>
               </w:rPr>
               <w:t xml:space="preserve">AIH de Longa Permanência e FTP</w:t>
+            </w:r>
+          </w:p>
+        </w:tc>
+      </w:tr>
+    </w:tbl>
+    <w:p>
+      <w:pPr>
+        <w:spacing w:after="200"/>
+      </w:pPr>
+    </w:p>
+    <w:p>
+      <w:pPr>
+        <w:pStyle w:val="Heading1"/>
+        <w:spacing w:after="80" w:before="300"/>
+      </w:pPr>
+      <w:r>
+        <w:rPr>
+          <w:b/>
+          <w:bCs/>
+          <w:color w:val="2C3E50"/>
+        </w:rPr>
+        <w:t xml:space="preserve">De_Para_Especialidade_Leito</w:t>
+      </w:r>
+    </w:p>
+    <w:p>
+      <w:pPr>
+        <w:spacing w:after="150"/>
+      </w:pPr>
+      <w:r>
+        <w:rPr>
+          <w:b/>
+          <w:bCs/>
+          <w:i w:val="false"/>
+          <w:iCs w:val="false"/>
+        </w:rPr>
+        <w:t xml:space="preserve">Liga a especialidade da internação (SIH) ao tipo de leito (CNES) — só recorte clínico/cirúrgico.</w:t>
+      </w:r>
+    </w:p>
+    <w:tbl>
+      <w:tblPr>
+        <w:tblW w:type="dxa" w:w="9000"/>
+        <w:tblBorders>
+          <w:top w:val="single" w:color="auto" w:sz="4"/>
+          <w:left w:val="single" w:color="auto" w:sz="4"/>
+          <w:bottom w:val="single" w:color="auto" w:sz="4"/>
+          <w:right w:val="single" w:color="auto" w:sz="4"/>
+          <w:insideH w:val="single" w:color="auto" w:sz="4"/>
+          <w:insideV w:val="single" w:color="auto" w:sz="4"/>
+        </w:tblBorders>
+      </w:tblPr>
+      <w:tblGrid>
+        <w:gridCol w:w="100"/>
+        <w:gridCol w:w="100"/>
+        <w:gridCol w:w="100"/>
+        <w:gridCol w:w="100"/>
+      </w:tblGrid>
+      <w:tr>
+        <w:trPr>
+          <w:tblHeader/>
+        </w:trPr>
+        <w:tc>
+          <w:tcPr>
+            <w:tcW w:type="dxa" w:w="2200"/>
+            <w:shd w:fill="2C3E50" w:val="clear"/>
+          </w:tcPr>
+          <w:p>
+            <w:r>
+              <w:rPr>
+                <w:b/>
+                <w:bCs/>
+                <w:color w:val="FFFFFF"/>
+                <w:sz w:val="18"/>
+                <w:szCs w:val="18"/>
+              </w:rPr>
+              <w:t xml:space="preserve">ESPEC</w:t>
+            </w:r>
+          </w:p>
+        </w:tc>
+        <w:tc>
+          <w:tcPr>
+            <w:tcW w:type="dxa" w:w="3000"/>
+            <w:shd w:fill="2C3E50" w:val="clear"/>
+          </w:tcPr>
+          <w:p>
+            <w:r>
+              <w:rPr>
+                <w:b/>
+                <w:bCs/>
+                <w:color w:val="FFFFFF"/>
+                <w:sz w:val="18"/>
+                <w:szCs w:val="18"/>
+              </w:rPr>
+              <w:t xml:space="preserve">Especialidade</w:t>
+            </w:r>
+          </w:p>
+        </w:tc>
+        <w:tc>
+          <w:tcPr>
+            <w:tcW w:type="dxa" w:w="2000"/>
+            <w:shd w:fill="2C3E50" w:val="clear"/>
+          </w:tcPr>
+          <w:p>
+            <w:r>
+              <w:rPr>
+                <w:b/>
+                <w:bCs/>
+                <w:color w:val="FFFFFF"/>
+                <w:sz w:val="18"/>
+                <w:szCs w:val="18"/>
+              </w:rPr>
+              <w:t xml:space="preserve">TP_LEITO</w:t>
+            </w:r>
+          </w:p>
+        </w:tc>
+        <w:tc>
+          <w:tcPr>
+            <w:tcW w:type="dxa" w:w="2000"/>
+            <w:shd w:fill="2C3E50" w:val="clear"/>
+          </w:tcPr>
+          <w:p>
+            <w:r>
+              <w:rPr>
+                <w:b/>
+                <w:bCs/>
+                <w:color w:val="FFFFFF"/>
+                <w:sz w:val="18"/>
+                <w:szCs w:val="18"/>
+              </w:rPr>
+              <w:t xml:space="preserve">Categoria</w:t>
+            </w:r>
+          </w:p>
+        </w:tc>
+      </w:tr>
+      <w:tr>
+        <w:tc>
+          <w:tcPr>
+            <w:tcW w:type="dxa" w:w="2200"/>
+          </w:tcPr>
+          <w:p>
+            <w:r>
+              <w:rPr>
+                <w:b w:val="false"/>
+                <w:bCs w:val="false"/>
+                <w:color w:val="000000"/>
+                <w:sz w:val="18"/>
+                <w:szCs w:val="18"/>
+              </w:rPr>
+              <w:t xml:space="preserve">01</w:t>
+            </w:r>
+          </w:p>
+        </w:tc>
+        <w:tc>
+          <w:tcPr>
+            <w:tcW w:type="dxa" w:w="3000"/>
+          </w:tcPr>
+          <w:p>
+            <w:r>
+              <w:rPr>
+                <w:b w:val="false"/>
+                <w:bCs w:val="false"/>
+                <w:color w:val="000000"/>
+                <w:sz w:val="18"/>
+                <w:szCs w:val="18"/>
+              </w:rPr>
+              <w:t xml:space="preserve">Cirurgia geral</w:t>
+            </w:r>
+          </w:p>
+        </w:tc>
+        <w:tc>
+          <w:tcPr>
+            <w:tcW w:type="dxa" w:w="2000"/>
+          </w:tcPr>
+          <w:p>
+            <w:r>
+              <w:rPr>
+                <w:b w:val="false"/>
+                <w:bCs w:val="false"/>
+                <w:color w:val="000000"/>
+                <w:sz w:val="18"/>
+                <w:szCs w:val="18"/>
+              </w:rPr>
+              <w:t xml:space="preserve">1</w:t>
+            </w:r>
+          </w:p>
+        </w:tc>
+        <w:tc>
+          <w:tcPr>
+            <w:tcW w:type="dxa" w:w="2000"/>
+          </w:tcPr>
+          <w:p>
+            <w:r>
+              <w:rPr>
+                <w:b w:val="false"/>
+                <w:bCs w:val="false"/>
+                <w:color w:val="000000"/>
+                <w:sz w:val="18"/>
+                <w:szCs w:val="18"/>
+              </w:rPr>
+              <w:t xml:space="preserve">Cirúrgico</w:t>
+            </w:r>
+          </w:p>
+        </w:tc>
+      </w:tr>
+      <w:tr>
+        <w:tc>
+          <w:tcPr>
+            <w:tcW w:type="dxa" w:w="2200"/>
+          </w:tcPr>
+          <w:p>
+            <w:r>
+              <w:rPr>
+                <w:b w:val="false"/>
+                <w:bCs w:val="false"/>
+                <w:color w:val="000000"/>
+                <w:sz w:val="18"/>
+                <w:szCs w:val="18"/>
+              </w:rPr>
+              <w:t xml:space="preserve">03</w:t>
+            </w:r>
+          </w:p>
+        </w:tc>
+        <w:tc>
+          <w:tcPr>
+            <w:tcW w:type="dxa" w:w="3000"/>
+          </w:tcPr>
+          <w:p>
+            <w:r>
+              <w:rPr>
+                <w:b w:val="false"/>
+                <w:bCs w:val="false"/>
+                <w:color w:val="000000"/>
+                <w:sz w:val="18"/>
+                <w:szCs w:val="18"/>
+              </w:rPr>
+              <w:t xml:space="preserve">Clínica médica</w:t>
+            </w:r>
+          </w:p>
+        </w:tc>
+        <w:tc>
+          <w:tcPr>
+            <w:tcW w:type="dxa" w:w="2000"/>
+          </w:tcPr>
+          <w:p>
+            <w:r>
+              <w:rPr>
+                <w:b w:val="false"/>
+                <w:bCs w:val="false"/>
+                <w:color w:val="000000"/>
+                <w:sz w:val="18"/>
+                <w:szCs w:val="18"/>
+              </w:rPr>
+              <w:t xml:space="preserve">2</w:t>
+            </w:r>
+          </w:p>
+        </w:tc>
+        <w:tc>
+          <w:tcPr>
+            <w:tcW w:type="dxa" w:w="2000"/>
+          </w:tcPr>
+          <w:p>
+            <w:r>
+              <w:rPr>
+                <w:b w:val="false"/>
+                <w:bCs w:val="false"/>
+                <w:color w:val="000000"/>
+                <w:sz w:val="18"/>
+                <w:szCs w:val="18"/>
+              </w:rPr>
+              <w:t xml:space="preserve">Clínico</w:t>
             </w:r>
           </w:p>
         </w:tc>

</xml_diff>